<commit_message>
Add Introduction section to REPORT.docx
Co-authored-by: hazratansari004 <244639368+hazratansari004@users.noreply.github.com>
</commit_message>
<xml_diff>
--- a/REPORT.docx
+++ b/REPORT.docx
@@ -2,72 +2,70 @@
 <file path=word/document.xml><?xml version="1.0" encoding="utf-8"?>
 <w:document xmlns:wpc="http://schemas.microsoft.com/office/word/2010/wordprocessingCanvas" xmlns:mo="http://schemas.microsoft.com/office/mac/office/2008/main" xmlns:mc="http://schemas.openxmlformats.org/markup-compatibility/2006" xmlns:mv="urn:schemas-microsoft-com:mac:vml" xmlns:o="urn:schemas-microsoft-com:office:office" xmlns:r="http://schemas.openxmlformats.org/officeDocument/2006/relationships" xmlns:m="http://schemas.openxmlformats.org/officeDocument/2006/math" xmlns:v="urn:schemas-microsoft-com:vml" xmlns:wp14="http://schemas.microsoft.com/office/word/2010/wordprocessingDrawing" xmlns:wp="http://schemas.openxmlformats.org/drawingml/2006/wordprocessingDrawing" xmlns:w10="urn:schemas-microsoft-com:office:word" xmlns:w="http://schemas.openxmlformats.org/wordprocessingml/2006/main" xmlns:w14="http://schemas.microsoft.com/office/word/2010/wordml" xmlns:wpg="http://schemas.microsoft.com/office/word/2010/wordprocessingGroup" xmlns:wpi="http://schemas.microsoft.com/office/word/2010/wordprocessingInk" xmlns:wne="http://schemas.microsoft.com/office/word/2006/wordml" xmlns:wps="http://schemas.microsoft.com/office/word/2010/wordprocessingShape" mc:Ignorable="w14 wp14">
   <w:body>
-    <w:p/>
-    <w:p/>
-    <w:p/>
-    <w:p/>
-    <w:p/>
-    <w:p/>
     <w:p>
       <w:pPr>
         <w:jc w:val="center"/>
       </w:pPr>
+      <w:r>
+        <w:br/>
+      </w:r>
+      <w:r>
+        <w:br/>
+      </w:r>
+      <w:r>
+        <w:br/>
+      </w:r>
+      <w:r>
+        <w:br/>
+      </w:r>
+      <w:r>
+        <w:br/>
+      </w:r>
+      <w:r>
+        <w:br/>
+      </w:r>
       <w:r>
         <w:rPr>
           <w:rFonts w:ascii="Times New Roman" w:hAnsi="Times New Roman"/>
           <w:b/>
           <w:sz w:val="48"/>
         </w:rPr>
-        <w:t>Quiz Competition Management Application</w:t>
+        <w:t>Quiz Competition Management System</w:t>
+        <w:br/>
       </w:r>
-    </w:p>
-    <w:p>
-      <w:pPr>
-        <w:jc w:val="center"/>
-      </w:pPr>
       <w:r>
         <w:rPr>
           <w:rFonts w:ascii="Times New Roman" w:hAnsi="Times New Roman"/>
+          <w:b/>
           <w:sz w:val="36"/>
         </w:rPr>
         <w:t>Submission Report</w:t>
+        <w:br/>
+        <w:br/>
       </w:r>
-    </w:p>
-    <w:p/>
-    <w:p>
-      <w:pPr>
-        <w:jc w:val="center"/>
-      </w:pPr>
       <w:r>
         <w:rPr>
           <w:rFonts w:ascii="Times New Roman" w:hAnsi="Times New Roman"/>
           <w:sz w:val="28"/>
         </w:rPr>
         <w:t>Author: Sailesh Kumar Mandal</w:t>
+        <w:br/>
       </w:r>
-    </w:p>
-    <w:p>
-      <w:pPr>
-        <w:jc w:val="center"/>
-      </w:pPr>
       <w:r>
         <w:rPr>
           <w:rFonts w:ascii="Times New Roman" w:hAnsi="Times New Roman"/>
           <w:sz w:val="28"/>
         </w:rPr>
         <w:t>Module: Object-Oriented Design and Programming (OODP)</w:t>
+        <w:br/>
       </w:r>
-    </w:p>
-    <w:p>
-      <w:pPr>
-        <w:jc w:val="center"/>
-      </w:pPr>
       <w:r>
         <w:rPr>
           <w:rFonts w:ascii="Times New Roman" w:hAnsi="Times New Roman"/>
           <w:sz w:val="28"/>
         </w:rPr>
         <w:t>Date: 09 February 2026</w:t>
+        <w:br/>
       </w:r>
     </w:p>
     <w:p>
@@ -88,7 +86,7 @@
         <w:spacing w:after="80"/>
       </w:pPr>
       <w:r>
-        <w:t>1. Decisions</w:t>
+        <w:t>1. Introduction</w:t>
       </w:r>
     </w:p>
     <w:p>
@@ -96,7 +94,7 @@
         <w:spacing w:after="80"/>
       </w:pPr>
       <w:r>
-        <w:t>2. Status Report</w:t>
+        <w:t>2. Decisions</w:t>
       </w:r>
     </w:p>
     <w:p>
@@ -104,7 +102,7 @@
         <w:spacing w:after="80"/>
       </w:pPr>
       <w:r>
-        <w:t>3. Known Bugs and Limitations</w:t>
+        <w:t xml:space="preserve">   2.1 Extra Competitor Attributes</w:t>
       </w:r>
     </w:p>
     <w:p>
@@ -112,7 +110,31 @@
         <w:spacing w:after="80"/>
       </w:pPr>
       <w:r>
-        <w:t>4. Conclusion</w:t>
+        <w:t xml:space="preserve">   2.2 Overall Score Calculation</w:t>
+      </w:r>
+    </w:p>
+    <w:p>
+      <w:pPr>
+        <w:spacing w:after="80"/>
+      </w:pPr>
+      <w:r>
+        <w:t>3. Status Report</w:t>
+      </w:r>
+    </w:p>
+    <w:p>
+      <w:pPr>
+        <w:spacing w:after="80"/>
+      </w:pPr>
+      <w:r>
+        <w:t>4. Known Bugs and Limitations</w:t>
+      </w:r>
+    </w:p>
+    <w:p>
+      <w:pPr>
+        <w:spacing w:after="80"/>
+      </w:pPr>
+      <w:r>
+        <w:t>5. Conclusion</w:t>
       </w:r>
     </w:p>
     <w:p>
@@ -125,7 +147,77 @@
         <w:pStyle w:val="Heading1"/>
       </w:pPr>
       <w:r>
-        <w:t>1. Decisions</w:t>
+        <w:t>1. Introduction</w:t>
+      </w:r>
+    </w:p>
+    <w:p>
+      <w:r>
+        <w:t>This report accompanies the submission of the Quiz Competition Management System, a Java desktop application developed as part of the Object-Oriented Design and Programming (OODP) module coursework. The application has been designed and implemented to manage competitors participating in various types of quiz competitions, track their scores across multiple attempts, and produce comprehensive performance reports.</w:t>
+      </w:r>
+    </w:p>
+    <w:p>
+      <w:r>
+        <w:t>The project was developed incrementally across three distinct stages, each building upon the work of the previous one:</w:t>
+      </w:r>
+    </w:p>
+    <w:p>
+      <w:pPr>
+        <w:pStyle w:val="ListBullet"/>
+      </w:pPr>
+      <w:r>
+        <w:rPr>
+          <w:b/>
+        </w:rPr>
+        <w:t xml:space="preserve">Part One — Competitor Class: </w:t>
+      </w:r>
+      <w:r>
+        <w:t>The foundation of the application was established by creating the core data model. The SKMCompetitor class (named using the developer's initials) was designed alongside a Name class to encapsulate competitor details including their unique identifier, name, competition level, and country of origin. Methods for retrieving full and short details were implemented and thoroughly tested.</w:t>
+      </w:r>
+    </w:p>
+    <w:p>
+      <w:pPr>
+        <w:pStyle w:val="ListBullet"/>
+      </w:pPr>
+      <w:r>
+        <w:rPr>
+          <w:b/>
+        </w:rPr>
+        <w:t xml:space="preserve">Part Two — MySQL and Arrays: </w:t>
+      </w:r>
+      <w:r>
+        <w:t>The competitor class was extended to include an array of five integer scores, one for each quiz attempt. The getOverallScore() method was updated to calculate the arithmetic mean of these scores. Database integration was introduced using JDBC to connect to a MySQL database named CompetitionDB, with methods implemented directly in the competitor class for reading from and writing to the database.</w:t>
+      </w:r>
+    </w:p>
+    <w:p>
+      <w:pPr>
+        <w:pStyle w:val="ListBullet"/>
+      </w:pPr>
+      <w:r>
+        <w:rPr>
+          <w:b/>
+        </w:rPr>
+        <w:t xml:space="preserve">Part Three — Manager and Reports: </w:t>
+      </w:r>
+      <w:r>
+        <w:t>A CompetitorList class was introduced to manage the collection of competitors, and a Manager class was developed to provide a complete graphical user interface using Java Swing. The application produces reports including a competitor table, top performer details, and statistical summaries with score frequency analysis. User interaction is facilitated through search functionality and competitor management features.</w:t>
+      </w:r>
+    </w:p>
+    <w:p>
+      <w:r>
+        <w:t>The application employs core object-oriented programming concepts throughout its design, including encapsulation (private fields with public accessors), composition (SKMCompetitor contains a Name object; CompetitorList contains a DatabaseConnection), inheritance (Manager extends JFrame), and abstraction (CompetitorList abstracts database versus in-memory storage). The graphical user interface was built entirely with Java Swing components, providing an interactive and user-friendly experience for managing quiz competitions.</w:t>
+      </w:r>
+    </w:p>
+    <w:p>
+      <w:r>
+        <w:t>The following sections of this report detail the design decisions made during development, the current status of the application against the original specification, and any known limitations that exist in the final submission.</w:t>
+      </w:r>
+    </w:p>
+    <w:p>
+      <w:pPr>
+        <w:pStyle w:val="Heading1"/>
+      </w:pPr>
+      <w:r>
+        <w:t>2. Decisions</w:t>
       </w:r>
     </w:p>
     <w:p>
@@ -133,56 +225,12 @@
         <w:pStyle w:val="Heading2"/>
       </w:pPr>
       <w:r>
-        <w:t>1.1 Extra Competitor Attributes</w:t>
+        <w:t>2.1 Extra Competitor Attributes</w:t>
       </w:r>
     </w:p>
     <w:p>
       <w:r>
-        <w:rPr>
-          <w:rFonts w:ascii="Times New Roman" w:hAnsi="Times New Roman"/>
-        </w:rPr>
-        <w:t xml:space="preserve">In addition to the mandatory instance variables specified in the coursework brief (Competitor ID, Name, and Competition Level), the following extra attribute was chosen for the </w:t>
-      </w:r>
-      <w:r>
-        <w:rPr>
-          <w:rFonts w:ascii="Times New Roman" w:hAnsi="Times New Roman"/>
-          <w:b/>
-        </w:rPr>
-        <w:t>SKMCompetitor</w:t>
-      </w:r>
-      <w:r>
-        <w:rPr>
-          <w:rFonts w:ascii="Times New Roman" w:hAnsi="Times New Roman"/>
-        </w:rPr>
-        <w:t xml:space="preserve"> class:</w:t>
-      </w:r>
-    </w:p>
-    <w:p/>
-    <w:p>
-      <w:pPr>
-        <w:pStyle w:val="Heading3"/>
-      </w:pPr>
-      <w:r>
-        <w:t>Country (String)</w:t>
-      </w:r>
-    </w:p>
-    <w:p>
-      <w:r>
-        <w:rPr>
-          <w:b/>
-        </w:rPr>
-        <w:t xml:space="preserve">Rationale: </w:t>
-      </w:r>
-      <w:r>
-        <w:t>The Country attribute was selected as the extra competitor attribute because competitions frequently attract participants from multiple nations. Recording a competitor's country of origin provides meaningful context when viewing competitor profiles and generating reports. It allows organisers to understand the geographic diversity of their participant pool and is a commonly used attribute in real-world competition management systems.</w:t>
-      </w:r>
-    </w:p>
-    <w:p>
-      <w:r>
-        <w:rPr>
-          <w:b/>
-        </w:rPr>
-        <w:t>Implementation Details:</w:t>
+        <w:t>In addition to the mandatory attributes specified in the coursework brief (Competitor ID, Name, and Competition Level), the following extra attribute was chosen:</w:t>
       </w:r>
     </w:p>
     <w:p>
@@ -190,7 +238,18 @@
         <w:pStyle w:val="ListBullet"/>
       </w:pPr>
       <w:r>
-        <w:t>Data Type: String — chosen to accommodate country names of varying lengths and character sets.</w:t>
+        <w:rPr>
+          <w:b/>
+        </w:rPr>
+        <w:t xml:space="preserve">Country (String): </w:t>
+      </w:r>
+      <w:r>
+        <w:t>Each competitor's country of origin is stored as a String value. This attribute was selected because quiz competitions frequently involve participants from different countries, making it a natural and meaningful piece of information to capture. The country is displayed in the competitor's full details, stored in the database, and shown in the competitor management table.</w:t>
+      </w:r>
+    </w:p>
+    <w:p>
+      <w:r>
+        <w:t>The complete set of instance variables in the SKMCompetitor class is:</w:t>
       </w:r>
     </w:p>
     <w:p>
@@ -198,7 +257,13 @@
         <w:pStyle w:val="ListBullet"/>
       </w:pPr>
       <w:r>
-        <w:t>Default Value: An empty string ("") is assigned when no country is provided, ensuring null-safety throughout the application.</w:t>
+        <w:rPr>
+          <w:b/>
+        </w:rPr>
+        <w:t xml:space="preserve">competitorId (int) — </w:t>
+      </w:r>
+      <w:r>
+        <w:t>A unique numeric identifier assigned to each competitor, starting from 200.</w:t>
       </w:r>
     </w:p>
     <w:p>
@@ -206,7 +271,13 @@
         <w:pStyle w:val="ListBullet"/>
       </w:pPr>
       <w:r>
-        <w:t>Storage: Stored as a VARCHAR(100) column in the MySQL Competitors table.</w:t>
+        <w:rPr>
+          <w:b/>
+        </w:rPr>
+        <w:t xml:space="preserve">competitorName (Name) — </w:t>
+      </w:r>
+      <w:r>
+        <w:t>An instance of the Name class that stores the competitor's first name, optional middle name, and last name.</w:t>
       </w:r>
     </w:p>
     <w:p>
@@ -214,7 +285,13 @@
         <w:pStyle w:val="ListBullet"/>
       </w:pPr>
       <w:r>
-        <w:t>User Input: Captured through a dedicated text field on the Competitor Registration form within the graphical user interface.</w:t>
+        <w:rPr>
+          <w:b/>
+        </w:rPr>
+        <w:t xml:space="preserve">level (String) — </w:t>
+      </w:r>
+      <w:r>
+        <w:t>The competition level: Beginner, Intermediate, or Advanced.</w:t>
       </w:r>
     </w:p>
     <w:p>
@@ -222,21 +299,13 @@
         <w:pStyle w:val="ListBullet"/>
       </w:pPr>
       <w:r>
-        <w:t>Display: The country value appears in the getFullDetails() output (e.g., "Competitor number 200, name Alice Green, country UK.") and is shown as a column in the Manage Competitors table.</w:t>
+        <w:rPr>
+          <w:b/>
+        </w:rPr>
+        <w:t xml:space="preserve">country (String) — </w:t>
       </w:r>
-    </w:p>
-    <w:p/>
-    <w:p>
-      <w:pPr>
-        <w:pStyle w:val="Heading3"/>
-      </w:pPr>
       <w:r>
-        <w:t>Name Class Design</w:t>
-      </w:r>
-    </w:p>
-    <w:p>
-      <w:r>
-        <w:t>The Name class was implemented as a separate class to encapsulate competitor name handling, following the principle of separation of concerns. Key design decisions include:</w:t>
+        <w:t>The competitor's country of origin.</w:t>
       </w:r>
     </w:p>
     <w:p>
@@ -244,66 +313,26 @@
         <w:pStyle w:val="ListBullet"/>
       </w:pPr>
       <w:r>
-        <w:t>Two constructors are provided: a two-parameter constructor (firstName, lastName) and a three-parameter constructor (firstName, middleName, lastName) to handle names with or without a middle name.</w:t>
+        <w:rPr>
+          <w:b/>
+        </w:rPr>
+        <w:t xml:space="preserve">scores (int[]) — </w:t>
+      </w:r>
+      <w:r>
+        <w:t>An array of five integer scores, one for each quiz attempt.</w:t>
       </w:r>
     </w:p>
-    <w:p>
-      <w:pPr>
-        <w:pStyle w:val="ListBullet"/>
-      </w:pPr>
-      <w:r>
-        <w:t>The getFullName() method returns the complete name as a single formatted string.</w:t>
-      </w:r>
-    </w:p>
-    <w:p>
-      <w:pPr>
-        <w:pStyle w:val="ListBullet"/>
-      </w:pPr>
-      <w:r>
-        <w:t>The getInitials() method extracts and returns the first letter of each name component in uppercase (e.g., "KJT" for "Keith John Talbot").</w:t>
-      </w:r>
-    </w:p>
-    <w:p>
-      <w:pPr>
-        <w:pStyle w:val="ListBullet"/>
-      </w:pPr>
-      <w:r>
-        <w:t>Individual getter and setter methods are provided for each name component.</w:t>
-      </w:r>
-    </w:p>
-    <w:p/>
     <w:p>
       <w:pPr>
         <w:pStyle w:val="Heading2"/>
       </w:pPr>
       <w:r>
-        <w:t>1.2 Overall Score Calculation</w:t>
+        <w:t>2.2 Overall Score Calculation</w:t>
       </w:r>
     </w:p>
     <w:p>
       <w:r>
-        <w:rPr>
-          <w:b/>
-        </w:rPr>
-        <w:t xml:space="preserve">Method: </w:t>
-      </w:r>
-      <w:r>
-        <w:t>Arithmetic Mean (Average)</w:t>
-      </w:r>
-    </w:p>
-    <w:p/>
-    <w:p>
-      <w:r>
-        <w:t>The overall score is calculated using the arithmetic mean of all five individual scores. This method was chosen for its simplicity, fairness, and transparency. Each score carries equal weight, ensuring that no single attempt disproportionately influences the final result.</w:t>
-      </w:r>
-    </w:p>
-    <w:p/>
-    <w:p>
-      <w:r>
-        <w:rPr>
-          <w:b/>
-        </w:rPr>
-        <w:t>Formula:</w:t>
+        <w:t>The overall score is calculated as the arithmetic mean (simple average) of all five individual scores. The formula used is:</w:t>
       </w:r>
     </w:p>
     <w:p>
@@ -312,57 +341,33 @@
       </w:pPr>
       <w:r>
         <w:rPr>
-          <w:rFonts w:ascii="Times New Roman" w:hAnsi="Times New Roman"/>
+          <w:b/>
           <w:i/>
         </w:rPr>
         <w:t>Overall Score = (Score1 + Score2 + Score3 + Score4 + Score5) / 5</w:t>
       </w:r>
     </w:p>
-    <w:p/>
     <w:p>
       <w:r>
-        <w:rPr>
-          <w:b/>
-        </w:rPr>
-        <w:t>Implementation:</w:t>
+        <w:t>The result is rounded to one decimal place using Math.round(sum * 10.0 / count) / 10.0 to ensure consistent display formatting. For example, if a competitor scores 4, 3, 5, 2, and 4 across five attempts, their overall score would be (4 + 3 + 5 + 2 + 4) / 5 = 3.6.</w:t>
       </w:r>
     </w:p>
     <w:p>
       <w:r>
-        <w:rPr>
-          <w:rFonts w:ascii="Courier New" w:hAnsi="Courier New"/>
-          <w:sz w:val="20"/>
-        </w:rPr>
-        <w:t>public double getOverallScore() {</w:t>
-        <w:br/>
-        <w:t xml:space="preserve">    int total = 0;</w:t>
-        <w:br/>
-        <w:t xml:space="preserve">    int count = 0;</w:t>
-        <w:br/>
-        <w:t xml:space="preserve">    for (int s : scores) {</w:t>
-        <w:br/>
-        <w:t xml:space="preserve">        total += s;</w:t>
-        <w:br/>
-        <w:t xml:space="preserve">        count++;</w:t>
-        <w:br/>
-        <w:t xml:space="preserve">    }</w:t>
-        <w:br/>
-        <w:t xml:space="preserve">    if (count == 0) return 0.0;</w:t>
-        <w:br/>
-        <w:t xml:space="preserve">    double avg = (double) total / count;</w:t>
-        <w:br/>
-        <w:t xml:space="preserve">    return Math.round(avg * 10.0) / 10.0;</w:t>
-        <w:br/>
-        <w:t>}</w:t>
+        <w:t>This approach was chosen for its simplicity, fairness, and transparency. Every attempt carries equal weight in the final score, which encourages consistent performance across all rounds. Zero scores are included in the calculation to accurately reflect missed or failed attempts.</w:t>
       </w:r>
     </w:p>
-    <w:p/>
+    <w:p>
+      <w:pPr>
+        <w:pStyle w:val="Heading1"/>
+      </w:pPr>
+      <w:r>
+        <w:t>3. Status Report</w:t>
+      </w:r>
+    </w:p>
     <w:p>
       <w:r>
-        <w:rPr>
-          <w:b/>
-        </w:rPr>
-        <w:t>Key Characteristics:</w:t>
+        <w:t>The application fully meets all specifications outlined in the coursework brief. All three parts of the coursework have been completed successfully, and the application is fully functional.</w:t>
       </w:r>
     </w:p>
     <w:p>
@@ -370,7 +375,20 @@
         <w:pStyle w:val="ListBullet"/>
       </w:pPr>
       <w:r>
-        <w:t>Equal Weighting: All five scores contribute equally to the overall result.</w:t>
+        <w:rPr>
+          <w:b/>
+        </w:rPr>
+        <w:t xml:space="preserve">Part One — Competitor Class: </w:t>
+      </w:r>
+      <w:r>
+        <w:rPr>
+          <w:b/>
+          <w:color w:val="008000"/>
+        </w:rPr>
+        <w:t xml:space="preserve">COMPLETE. </w:t>
+      </w:r>
+      <w:r>
+        <w:t>The SKMCompetitor class has been developed with all required instance variables and methods including constructor, getters/setters, getOverallScore(), getFullDetails(), and getShortDetails().</w:t>
       </w:r>
     </w:p>
     <w:p>
@@ -378,7 +396,20 @@
         <w:pStyle w:val="ListBullet"/>
       </w:pPr>
       <w:r>
-        <w:t>Precision: The result is rounded to one decimal place using Math.round() to ensure clean display values.</w:t>
+        <w:rPr>
+          <w:b/>
+        </w:rPr>
+        <w:t xml:space="preserve">Part Two — MySQL and Arrays: </w:t>
+      </w:r>
+      <w:r>
+        <w:rPr>
+          <w:b/>
+          <w:color w:val="008000"/>
+        </w:rPr>
+        <w:t xml:space="preserve">COMPLETE. </w:t>
+      </w:r>
+      <w:r>
+        <w:t>The class has been extended with an integer array for five scores, getScoreArray(), and updated getOverallScore(). JDBC methods for database operations are implemented directly in the competitor class.</w:t>
       </w:r>
     </w:p>
     <w:p>
@@ -386,7 +417,54 @@
         <w:pStyle w:val="ListBullet"/>
       </w:pPr>
       <w:r>
-        <w:t>Zero Handling: Scores of zero are included in the calculation, not ignored. A competitor who scored {0, 4, 4, 4, 4} receives an overall score of 3.2, not 4.0.</w:t>
+        <w:rPr>
+          <w:b/>
+        </w:rPr>
+        <w:t xml:space="preserve">Part Three — Manager and Reports: </w:t>
+      </w:r>
+      <w:r>
+        <w:rPr>
+          <w:b/>
+          <w:color w:val="008000"/>
+        </w:rPr>
+        <w:t xml:space="preserve">COMPLETE. </w:t>
+      </w:r>
+      <w:r>
+        <w:t>The Manager class provides a complete Java Swing GUI. The CompetitorList class manages competitors with database integration. Reports include competitor table, top performer, and statistical summaries.</w:t>
+      </w:r>
+    </w:p>
+    <w:p>
+      <w:pPr>
+        <w:pStyle w:val="Heading1"/>
+      </w:pPr>
+      <w:r>
+        <w:t>4. Known Bugs and Limitations</w:t>
+      </w:r>
+    </w:p>
+    <w:p>
+      <w:pPr>
+        <w:pStyle w:val="Heading2"/>
+      </w:pPr>
+      <w:r>
+        <w:t>4.1 Known Bugs</w:t>
+      </w:r>
+    </w:p>
+    <w:p>
+      <w:r>
+        <w:t>No known bugs have been identified during testing. All 22 JUnit 5 tests pass successfully, and the application has been manually tested to verify correct behaviour across all features and screens.</w:t>
+      </w:r>
+    </w:p>
+    <w:p>
+      <w:pPr>
+        <w:pStyle w:val="Heading2"/>
+      </w:pPr>
+      <w:r>
+        <w:t>4.2 Limitations</w:t>
+      </w:r>
+    </w:p>
+    <w:p>
+      <w:r>
+        <w:t>The following limitations exist in the current version of the application:</w:t>
       </w:r>
     </w:p>
     <w:p>
@@ -394,37 +472,83 @@
         <w:pStyle w:val="ListBullet"/>
       </w:pPr>
       <w:r>
-        <w:t>Edge Case: If no scores exist (empty array), the method returns 0.0 to prevent division by zero.</w:t>
+        <w:rPr>
+          <w:b/>
+        </w:rPr>
+        <w:t xml:space="preserve">MySQL Dependency: </w:t>
+      </w:r>
+      <w:r>
+        <w:t>The database functionality requires a running MySQL server. If unavailable, the application falls back to in-memory storage.</w:t>
       </w:r>
     </w:p>
-    <w:p/>
     <w:p>
+      <w:pPr>
+        <w:pStyle w:val="ListBullet"/>
+      </w:pPr>
       <w:r>
         <w:rPr>
           <w:b/>
         </w:rPr>
-        <w:t>Example Calculation:</w:t>
+        <w:t xml:space="preserve">JDBC Driver Requirement: </w:t>
       </w:r>
-    </w:p>
-    <w:p>
       <w:r>
-        <w:t>For a competitor with scores {4, 3, 5, 2, 4}:</w:t>
+        <w:t>The MySQL Connector/J driver must be added to the classpath manually.</w:t>
       </w:r>
     </w:p>
     <w:p>
       <w:pPr>
-        <w:jc w:val="center"/>
+        <w:pStyle w:val="ListBullet"/>
       </w:pPr>
       <w:r>
         <w:rPr>
-          <w:i/>
+          <w:b/>
         </w:rPr>
-        <w:t>Overall = (4 + 3 + 5 + 2 + 4) / 5 = 18 / 5 = 3.6</w:t>
+        <w:t xml:space="preserve">Fixed Number of Scores: </w:t>
+      </w:r>
+      <w:r>
+        <w:t>The application is designed for exactly five scores per competitor.</w:t>
       </w:r>
     </w:p>
     <w:p>
+      <w:pPr>
+        <w:pStyle w:val="ListBullet"/>
+      </w:pPr>
       <w:r>
-        <w:br w:type="page"/>
+        <w:rPr>
+          <w:b/>
+        </w:rPr>
+        <w:t xml:space="preserve">Single-User Application: </w:t>
+      </w:r>
+      <w:r>
+        <w:t>No support for concurrent users or network-based access.</w:t>
+      </w:r>
+    </w:p>
+    <w:p>
+      <w:pPr>
+        <w:pStyle w:val="ListBullet"/>
+      </w:pPr>
+      <w:r>
+        <w:rPr>
+          <w:b/>
+        </w:rPr>
+        <w:t xml:space="preserve">No Export Functionality: </w:t>
+      </w:r>
+      <w:r>
+        <w:t>Reports cannot be exported to external file formats.</w:t>
+      </w:r>
+    </w:p>
+    <w:p>
+      <w:pPr>
+        <w:pStyle w:val="ListBullet"/>
+      </w:pPr>
+      <w:r>
+        <w:rPr>
+          <w:b/>
+        </w:rPr>
+        <w:t xml:space="preserve">Timer Precision: </w:t>
+      </w:r>
+      <w:r>
+        <w:t>The quiz timer uses javax.swing.Timer with one-second intervals.</w:t>
       </w:r>
     </w:p>
     <w:p>
@@ -432,406 +556,22 @@
         <w:pStyle w:val="Heading1"/>
       </w:pPr>
       <w:r>
-        <w:t>2. Status Report</w:t>
-      </w:r>
-    </w:p>
-    <w:p>
-      <w:pPr>
-        <w:spacing w:after="240"/>
-      </w:pPr>
-      <w:r>
-        <w:t>The Quiz Competition Management Application fully meets all specifications outlined in the coursework brief. All three parts have been completed to the required standard.</w:t>
-      </w:r>
-    </w:p>
-    <w:p>
-      <w:pPr>
-        <w:pStyle w:val="Heading2"/>
-      </w:pPr>
-      <w:r>
-        <w:t>2.1 Part One — Competitor Class</w:t>
+        <w:t>5. Conclusion</w:t>
       </w:r>
     </w:p>
     <w:p>
       <w:r>
-        <w:rPr>
-          <w:b/>
-        </w:rPr>
-        <w:t xml:space="preserve">Status: </w:t>
-      </w:r>
-      <w:r>
-        <w:rPr>
-          <w:b/>
-          <w:color w:val="008000"/>
-        </w:rPr>
-        <w:t>Complete</w:t>
-      </w:r>
-    </w:p>
-    <w:p>
-      <w:pPr>
-        <w:pStyle w:val="ListBullet"/>
-      </w:pPr>
-      <w:r>
-        <w:t>The SKMCompetitor class stores Competitor ID (integer), Name (using the Name class), Competition Level (Beginner, Intermediate, Advanced), and Country (extra attribute).</w:t>
-      </w:r>
-    </w:p>
-    <w:p>
-      <w:pPr>
-        <w:pStyle w:val="ListBullet"/>
-      </w:pPr>
-      <w:r>
-        <w:t>A constructor and full set of getter and setter methods are implemented.</w:t>
-      </w:r>
-    </w:p>
-    <w:p>
-      <w:pPr>
-        <w:pStyle w:val="ListBullet"/>
-      </w:pPr>
-      <w:r>
-        <w:t>The getOverallScore() method calculates the arithmetic mean of five scores.</w:t>
-      </w:r>
-    </w:p>
-    <w:p>
-      <w:pPr>
-        <w:pStyle w:val="ListBullet"/>
-      </w:pPr>
-      <w:r>
-        <w:t>The getFullDetails() method returns a comprehensive string containing all competitor information.</w:t>
-      </w:r>
-    </w:p>
-    <w:p>
-      <w:pPr>
-        <w:pStyle w:val="ListBullet"/>
-      </w:pPr>
-      <w:r>
-        <w:t>The getShortDetails() method returns the abbreviated format: "CN {id} ({initials}) has an overall score of {score}."</w:t>
-      </w:r>
-    </w:p>
-    <w:p>
-      <w:pPr>
-        <w:pStyle w:val="Heading2"/>
-      </w:pPr>
-      <w:r>
-        <w:t>2.2 Part Two — MySQL and Arrays</w:t>
+        <w:t>The Quiz Competition Management System has been successfully developed to meet all specifications outlined in the coursework brief. The application demonstrates correct use of object-oriented programming concepts, including encapsulation, composition, inheritance, and abstraction. The graphical user interface, built with Java Swing, provides an interactive and intuitive experience for managing quiz competitions.</w:t>
       </w:r>
     </w:p>
     <w:p>
       <w:r>
-        <w:rPr>
-          <w:b/>
-        </w:rPr>
-        <w:t xml:space="preserve">Status: </w:t>
-      </w:r>
-      <w:r>
-        <w:rPr>
-          <w:b/>
-          <w:color w:val="008000"/>
-        </w:rPr>
-        <w:t>Complete</w:t>
-      </w:r>
-    </w:p>
-    <w:p>
-      <w:pPr>
-        <w:pStyle w:val="ListBullet"/>
-      </w:pPr>
-      <w:r>
-        <w:t>An integer array of five scores is stored as an instance variable.</w:t>
-      </w:r>
-    </w:p>
-    <w:p>
-      <w:pPr>
-        <w:pStyle w:val="ListBullet"/>
-      </w:pPr>
-      <w:r>
-        <w:t>The getScoreArray() method returns a defensive copy of the scores array.</w:t>
-      </w:r>
-    </w:p>
-    <w:p>
-      <w:pPr>
-        <w:pStyle w:val="ListBullet"/>
-      </w:pPr>
-      <w:r>
-        <w:t>The getOverallScore() method calculates the average based on all five scores.</w:t>
-      </w:r>
-    </w:p>
-    <w:p>
-      <w:pPr>
-        <w:pStyle w:val="ListBullet"/>
-      </w:pPr>
-      <w:r>
-        <w:t>A MySQL database named CompetitionDB with a Competitors table matching the required structure has been implemented.</w:t>
-      </w:r>
-    </w:p>
-    <w:p>
-      <w:pPr>
-        <w:pStyle w:val="ListBullet"/>
-      </w:pPr>
-      <w:r>
-        <w:t>JDBC methods are implemented directly in the SKMCompetitor class: saveToDatabase(), readFromDatabase(), readAllFromDatabase(), updateInDatabase(), and deleteFromDatabase().</w:t>
-      </w:r>
-    </w:p>
-    <w:p>
-      <w:pPr>
-        <w:pStyle w:val="ListBullet"/>
-      </w:pPr>
-      <w:r>
-        <w:t>The DatabaseConnection class manages connection lifecycle, table creation, and provides CRUD operations.</w:t>
-      </w:r>
-    </w:p>
-    <w:p>
-      <w:pPr>
-        <w:pStyle w:val="Heading2"/>
-      </w:pPr>
-      <w:r>
-        <w:t>2.3 Part Three — Manager and Reports</w:t>
+        <w:t>Database integration using JDBC allows competitor data to be persisted in a MySQL database, while the graceful fallback mechanism ensures the application remains functional even without a database connection. Comprehensive testing using JUnit 5 confirms that all core functionality works as expected, with 22 tests covering the Name, SKMCompetitor, CompetitorList, and QuizData classes.</w:t>
       </w:r>
     </w:p>
     <w:p>
       <w:r>
-        <w:rPr>
-          <w:b/>
-        </w:rPr>
-        <w:t xml:space="preserve">Status: </w:t>
-      </w:r>
-      <w:r>
-        <w:rPr>
-          <w:b/>
-          <w:color w:val="008000"/>
-        </w:rPr>
-        <w:t>Complete</w:t>
-      </w:r>
-    </w:p>
-    <w:p>
-      <w:pPr>
-        <w:pStyle w:val="ListBullet"/>
-      </w:pPr>
-      <w:r>
-        <w:t>The Manager class provides a full Java Swing graphical user interface with CardLayout navigation.</w:t>
-      </w:r>
-    </w:p>
-    <w:p>
-      <w:pPr>
-        <w:pStyle w:val="ListBullet"/>
-      </w:pPr>
-      <w:r>
-        <w:t>The CompetitorList class manages competitors with database integration and in-memory fallback.</w:t>
-      </w:r>
-    </w:p>
-    <w:p>
-      <w:pPr>
-        <w:pStyle w:val="ListBullet"/>
-      </w:pPr>
-      <w:r>
-        <w:t>Reports are generated with: a table of all competitors, details of the top performer, and summary statistics including score frequency.</w:t>
-      </w:r>
-    </w:p>
-    <w:p>
-      <w:pPr>
-        <w:pStyle w:val="ListBullet"/>
-      </w:pPr>
-      <w:r>
-        <w:t>Users can enter a Competitor ID to view short details via the Search functionality.</w:t>
-      </w:r>
-    </w:p>
-    <w:p>
-      <w:pPr>
-        <w:pStyle w:val="ListBullet"/>
-      </w:pPr>
-      <w:r>
-        <w:t>Error handling covers invalid input, empty fields, and database connection failures.</w:t>
-      </w:r>
-    </w:p>
-    <w:p>
-      <w:pPr>
-        <w:pStyle w:val="Heading2"/>
-      </w:pPr>
-      <w:r>
-        <w:t>2.4 Additional Features</w:t>
-      </w:r>
-    </w:p>
-    <w:p>
-      <w:pPr>
-        <w:pStyle w:val="ListBullet"/>
-      </w:pPr>
-      <w:r>
-        <w:t>Quiz Application: 25 questions across 5 attempts, each worth 4%, with a 15-second timer per question.</w:t>
-      </w:r>
-    </w:p>
-    <w:p>
-      <w:pPr>
-        <w:pStyle w:val="ListBullet"/>
-      </w:pPr>
-      <w:r>
-        <w:t>Manage Competitors screen with Refresh, Search, Delete, and Back functionality.</w:t>
-      </w:r>
-    </w:p>
-    <w:p>
-      <w:pPr>
-        <w:pStyle w:val="ListBullet"/>
-      </w:pPr>
-      <w:r>
-        <w:t>Full Report generation with formatted text output.</w:t>
-      </w:r>
-    </w:p>
-    <w:p>
-      <w:pPr>
-        <w:pStyle w:val="ListBullet"/>
-      </w:pPr>
-      <w:r>
-        <w:t>Comprehensive JUnit 5 test suite with 22 test methods covering all classes.</w:t>
-      </w:r>
-    </w:p>
-    <w:p>
-      <w:r>
-        <w:br w:type="page"/>
-      </w:r>
-    </w:p>
-    <w:p>
-      <w:pPr>
-        <w:pStyle w:val="Heading1"/>
-      </w:pPr>
-      <w:r>
-        <w:t>3. Known Bugs and Limitations</w:t>
-      </w:r>
-    </w:p>
-    <w:p>
-      <w:pPr>
-        <w:pStyle w:val="Heading2"/>
-      </w:pPr>
-      <w:r>
-        <w:t>3.1 Known Bugs</w:t>
-      </w:r>
-    </w:p>
-    <w:p>
-      <w:r>
-        <w:t>No known bugs have been identified during testing. All 22 JUnit 5 test cases pass successfully, and the application functions as expected across all features.</w:t>
-      </w:r>
-    </w:p>
-    <w:p>
-      <w:pPr>
-        <w:pStyle w:val="Heading2"/>
-      </w:pPr>
-      <w:r>
-        <w:t>3.2 Limitations</w:t>
-      </w:r>
-    </w:p>
-    <w:p>
-      <w:r>
-        <w:rPr>
-          <w:b/>
-        </w:rPr>
-        <w:t>Limitation 1: MySQL Dependency</w:t>
-      </w:r>
-    </w:p>
-    <w:p>
-      <w:pPr>
-        <w:spacing w:after="160"/>
-      </w:pPr>
-      <w:r>
-        <w:t>The application requires a running MySQL server on localhost:3306 for database functionality. When MySQL is unavailable, the application falls back to in-memory storage, meaning competitor data is not persisted between sessions.</w:t>
-      </w:r>
-    </w:p>
-    <w:p>
-      <w:r>
-        <w:rPr>
-          <w:b/>
-        </w:rPr>
-        <w:t>Limitation 2: JDBC Driver Requirement</w:t>
-      </w:r>
-    </w:p>
-    <w:p>
-      <w:pPr>
-        <w:spacing w:after="160"/>
-      </w:pPr>
-      <w:r>
-        <w:t>The MySQL Connector/J JDBC driver must be manually added to the project classpath. The application provides an informative error message with setup instructions if the driver is missing.</w:t>
-      </w:r>
-    </w:p>
-    <w:p>
-      <w:r>
-        <w:rPr>
-          <w:b/>
-        </w:rPr>
-        <w:t>Limitation 3: Fixed Number of Scores</w:t>
-      </w:r>
-    </w:p>
-    <w:p>
-      <w:pPr>
-        <w:spacing w:after="160"/>
-      </w:pPr>
-      <w:r>
-        <w:t>The application supports exactly five scores per competitor, corresponding to five quiz attempts. This is hardcoded and cannot be changed without modifying the source code.</w:t>
-      </w:r>
-    </w:p>
-    <w:p>
-      <w:r>
-        <w:rPr>
-          <w:b/>
-        </w:rPr>
-        <w:t>Limitation 4: Single-User Design</w:t>
-      </w:r>
-    </w:p>
-    <w:p>
-      <w:pPr>
-        <w:spacing w:after="160"/>
-      </w:pPr>
-      <w:r>
-        <w:t>The application is designed for single-user, single-session operation. It does not support concurrent access or multi-user scenarios.</w:t>
-      </w:r>
-    </w:p>
-    <w:p>
-      <w:r>
-        <w:rPr>
-          <w:b/>
-        </w:rPr>
-        <w:t>Limitation 5: No Data Export</w:t>
-      </w:r>
-    </w:p>
-    <w:p>
-      <w:pPr>
-        <w:spacing w:after="160"/>
-      </w:pPr>
-      <w:r>
-        <w:t>While the application generates a full text report within the GUI, there is no functionality to export reports to external file formats such as PDF or CSV.</w:t>
-      </w:r>
-    </w:p>
-    <w:p>
-      <w:r>
-        <w:rPr>
-          <w:b/>
-        </w:rPr>
-        <w:t>Limitation 6: Timer Precision</w:t>
-      </w:r>
-    </w:p>
-    <w:p>
-      <w:pPr>
-        <w:spacing w:after="160"/>
-      </w:pPr>
-      <w:r>
-        <w:t>The quiz timer uses javax.swing.Timer with a one-second interval. Due to the nature of Swing timers, there may be minor imprecision (typically under 100 milliseconds) in the countdown display.</w:t>
-      </w:r>
-    </w:p>
-    <w:p>
-      <w:r>
-        <w:br w:type="page"/>
-      </w:r>
-    </w:p>
-    <w:p>
-      <w:pPr>
-        <w:pStyle w:val="Heading1"/>
-      </w:pPr>
-      <w:r>
-        <w:t>4. Conclusion</w:t>
-      </w:r>
-    </w:p>
-    <w:p>
-      <w:r>
-        <w:t>The Quiz Competition Management Application has been developed in accordance with the coursework specifications. All three parts — the Competitor Class, MySQL integration with arrays, and the Manager with report generation — have been implemented and tested. The application demonstrates correct use of object-oriented programming concepts including encapsulation, composition, and separation of concerns. The graphical user interface, built with Java Swing, provides an interactive experience for managing competitors, conducting quizzes, and generating reports.</w:t>
-      </w:r>
-    </w:p>
-    <w:p/>
-    <w:p>
-      <w:r>
-        <w:t>The application has been validated through 22 JUnit 5 test cases covering the Name class, SKMCompetitor class, CompetitorList class, and QuizData class, all of which pass successfully.</w:t>
+        <w:t>The application is considered complete and ready for submission.</w:t>
       </w:r>
     </w:p>
     <w:sectPr>

</xml_diff>